<commit_message>
Restore missing step 2 on Pages setup screenshot
</commit_message>
<xml_diff>
--- a/docs/shift-register-quickstart/quickstart-revised.docx
+++ b/docs/shift-register-quickstart/quickstart-revised.docx
@@ -46,7 +46,7 @@
           <w:noProof/>
         </w:rPr>
         <w:drawing>
-          <wp:inline distT="0" distB="0" distL="0" distR="0" wp14:anchorId="5654F8EA" wp14:editId="14DE1129">
+          <wp:inline distT="0" distB="0" distL="0" distR="0" wp14:anchorId="09A68D1B" wp14:editId="557FEF11">
             <wp:extent cx="6217920" cy="1450848"/>
             <wp:effectExtent l="0" t="0" r="0" b="0"/>
             <wp:docPr id="1" name="Picture 1"/>
@@ -293,7 +293,7 @@
           <w:noProof/>
         </w:rPr>
         <w:drawing>
-          <wp:inline distT="0" distB="0" distL="0" distR="0" wp14:anchorId="264517CE" wp14:editId="43AEFF5F">
+          <wp:inline distT="0" distB="0" distL="0" distR="0" wp14:anchorId="28034A1A" wp14:editId="213E82A4">
             <wp:extent cx="6217920" cy="1450848"/>
             <wp:effectExtent l="0" t="0" r="0" b="0"/>
             <wp:docPr id="2" name="Picture 2"/>
@@ -841,7 +841,7 @@
           <w:noProof/>
         </w:rPr>
         <w:drawing>
-          <wp:inline distT="0" distB="0" distL="0" distR="0" wp14:anchorId="2B87A892" wp14:editId="0E5AA057">
+          <wp:inline distT="0" distB="0" distL="0" distR="0" wp14:anchorId="76269415" wp14:editId="410BE6E9">
             <wp:extent cx="6217920" cy="2627071"/>
             <wp:effectExtent l="0" t="0" r="0" b="0"/>
             <wp:docPr id="3" name="Picture 3"/>
@@ -1081,8 +1081,8 @@
           <w:noProof/>
         </w:rPr>
         <w:drawing>
-          <wp:inline distT="0" distB="0" distL="0" distR="0" wp14:anchorId="45C5DF08" wp14:editId="5309FCF0">
-            <wp:extent cx="6217920" cy="1719349"/>
+          <wp:inline distT="0" distB="0" distL="0" distR="0" wp14:anchorId="00A64719" wp14:editId="06024461">
+            <wp:extent cx="5860472" cy="2743200"/>
             <wp:effectExtent l="0" t="0" r="0" b="0"/>
             <wp:docPr id="4" name="Picture 4"/>
             <wp:cNvGraphicFramePr>
@@ -1092,7 +1092,7 @@
               <a:graphicData uri="http://schemas.openxmlformats.org/drawingml/2006/picture">
                 <pic:pic xmlns:pic="http://schemas.openxmlformats.org/drawingml/2006/picture">
                   <pic:nvPicPr>
-                    <pic:cNvPr id="0" name="pages-source-detail.png"/>
+                    <pic:cNvPr id="0" name="pages-numbered.png"/>
                     <pic:cNvPicPr/>
                   </pic:nvPicPr>
                   <pic:blipFill>
@@ -1104,7 +1104,7 @@
                   <pic:spPr>
                     <a:xfrm>
                       <a:off x="0" y="0"/>
-                      <a:ext cx="6217920" cy="1719349"/>
+                      <a:ext cx="5860472" cy="2743200"/>
                     </a:xfrm>
                     <a:prstGeom prst="rect">
                       <a:avLst/>
@@ -1126,7 +1126,7 @@
           <w:color w:val="5E6D78"/>
           <w:sz w:val="17"/>
         </w:rPr>
-        <w:t>Enlarged detail. Official Tiny Tapeout FAQ image: Source is set to GitHub Actions. Its example repository name may differ from yours.</w:t>
+        <w:t>1 Settings → 2 Pages → 3 GitHub Actions. Official FAQ screenshot; step 2 annotation added.</w:t>
       </w:r>
     </w:p>
     <w:p>
@@ -1265,7 +1265,7 @@
           <w:noProof/>
         </w:rPr>
         <w:drawing>
-          <wp:inline distT="0" distB="0" distL="0" distR="0" wp14:anchorId="41396485" wp14:editId="51D21A48">
+          <wp:inline distT="0" distB="0" distL="0" distR="0" wp14:anchorId="2005FCDB" wp14:editId="20C224B3">
             <wp:extent cx="6217920" cy="1450848"/>
             <wp:effectExtent l="0" t="0" r="0" b="0"/>
             <wp:docPr id="5" name="Picture 5"/>
@@ -2499,7 +2499,7 @@
           <w:noProof/>
         </w:rPr>
         <w:drawing>
-          <wp:inline distT="0" distB="0" distL="0" distR="0" wp14:anchorId="04471F71" wp14:editId="378DD904">
+          <wp:inline distT="0" distB="0" distL="0" distR="0" wp14:anchorId="5306B7FD" wp14:editId="43CD35A5">
             <wp:extent cx="6217920" cy="1450848"/>
             <wp:effectExtent l="0" t="0" r="0" b="0"/>
             <wp:docPr id="6" name="Picture 6"/>
@@ -3848,7 +3848,7 @@
           <w:noProof/>
         </w:rPr>
         <w:drawing>
-          <wp:inline distT="0" distB="0" distL="0" distR="0" wp14:anchorId="57CB3350" wp14:editId="297C5B22">
+          <wp:inline distT="0" distB="0" distL="0" distR="0" wp14:anchorId="328FDD19" wp14:editId="5421DFF9">
             <wp:extent cx="6217920" cy="1087287"/>
             <wp:effectExtent l="0" t="0" r="0" b="0"/>
             <wp:docPr id="7" name="Picture 7"/>
@@ -4072,7 +4072,7 @@
           <w:noProof/>
         </w:rPr>
         <w:drawing>
-          <wp:inline distT="0" distB="0" distL="0" distR="0" wp14:anchorId="22C0DD61" wp14:editId="5BF9844A">
+          <wp:inline distT="0" distB="0" distL="0" distR="0" wp14:anchorId="329A2FC5" wp14:editId="60276A03">
             <wp:extent cx="4620126" cy="2743200"/>
             <wp:effectExtent l="0" t="0" r="0" b="0"/>
             <wp:docPr id="8" name="Picture 8"/>
@@ -4306,7 +4306,7 @@
           <w:noProof/>
         </w:rPr>
         <w:drawing>
-          <wp:inline distT="0" distB="0" distL="0" distR="0" wp14:anchorId="0E54F19D" wp14:editId="6BC5C8A2">
+          <wp:inline distT="0" distB="0" distL="0" distR="0" wp14:anchorId="631ADFF0" wp14:editId="190DD4C7">
             <wp:extent cx="6217920" cy="2556256"/>
             <wp:effectExtent l="0" t="0" r="0" b="0"/>
             <wp:docPr id="9" name="Picture 9"/>
@@ -5417,7 +5417,7 @@
           <w:noProof/>
         </w:rPr>
         <w:drawing>
-          <wp:inline distT="0" distB="0" distL="0" distR="0" wp14:anchorId="1DAEDC53" wp14:editId="58471E2A">
+          <wp:inline distT="0" distB="0" distL="0" distR="0" wp14:anchorId="42A8A0EC" wp14:editId="5A325446">
             <wp:extent cx="6217920" cy="2131858"/>
             <wp:effectExtent l="0" t="0" r="0" b="0"/>
             <wp:docPr id="10" name="Picture 10"/>
@@ -6179,31 +6179,31 @@
       </w:rPr>
     </w:lvl>
   </w:abstractNum>
-  <w:num w:numId="1" w16cid:durableId="118650339">
+  <w:num w:numId="1" w16cid:durableId="887104333">
     <w:abstractNumId w:val="8"/>
   </w:num>
-  <w:num w:numId="2" w16cid:durableId="523516327">
+  <w:num w:numId="2" w16cid:durableId="1749379391">
     <w:abstractNumId w:val="6"/>
   </w:num>
-  <w:num w:numId="3" w16cid:durableId="1474560883">
+  <w:num w:numId="3" w16cid:durableId="1700083222">
     <w:abstractNumId w:val="5"/>
   </w:num>
-  <w:num w:numId="4" w16cid:durableId="1542356004">
+  <w:num w:numId="4" w16cid:durableId="491138551">
     <w:abstractNumId w:val="4"/>
   </w:num>
-  <w:num w:numId="5" w16cid:durableId="1304312495">
+  <w:num w:numId="5" w16cid:durableId="1411805349">
     <w:abstractNumId w:val="7"/>
   </w:num>
-  <w:num w:numId="6" w16cid:durableId="1700861107">
+  <w:num w:numId="6" w16cid:durableId="520094461">
     <w:abstractNumId w:val="3"/>
   </w:num>
-  <w:num w:numId="7" w16cid:durableId="1148742246">
+  <w:num w:numId="7" w16cid:durableId="992489701">
     <w:abstractNumId w:val="2"/>
   </w:num>
-  <w:num w:numId="8" w16cid:durableId="1219781902">
+  <w:num w:numId="8" w16cid:durableId="2115830607">
     <w:abstractNumId w:val="1"/>
   </w:num>
-  <w:num w:numId="9" w16cid:durableId="2102022731">
+  <w:num w:numId="9" w16cid:durableId="574827262">
     <w:abstractNumId w:val="0"/>
   </w:num>
 </w:numbering>

</xml_diff>